<commit_message>
Daily content delivery 2026-09-04 (writing research-rebase correction): align 11 articles to v1.1/v1.2, rebuild QA/manifest/report/state/delivery, apply publish-grade source gate
</commit_message>
<xml_diff>
--- a/deliveries/2026-09-04/AutoBridge_Daily_2026-09-04/01_Vehicle_Pages/VEH_20260904_01_Chery_Arrizo8.docx
+++ b/deliveries/2026-09-04/AutoBridge_Daily_2026-09-04/01_Vehicle_Pages/VEH_20260904_01_Chery_Arrizo8.docx
@@ -113,7 +113,7 @@
         <w:t>Internal Link Suggestions</w:t>
       </w:r>
       <w:r>
-        <w:t>: /guides/vehicle-vin-wmi-nameplate-compliance/ ; /guides/chinese-vehicle-emission-fuel-compatibility/ ; /guides/export-vehicle-document-package/</w:t>
+        <w:t>: /guides/vin-nameplate-verification-chinese-vehicles/ ; /guides/emission-fuel-compatibility-china-vehicles/ ; /guides/export-vehicle-document-package/</w:t>
       </w:r>
     </w:p>
     <w:p>
@@ -1368,10 +1368,10 @@
         <w:rPr>
           <w:b/>
         </w:rPr>
-        <w:t>Author / reviewer</w:t>
+        <w:t>Author</w:t>
       </w:r>
       <w:r>
-        <w:t>: [AutoBridge Export Sourcing Team](/authors/) · method per our [Editorial Policy](/editorial-policy/)</w:t>
+        <w:t>: AutoBridge Export Editorial Team · [Sourcing Team](/authors/) · method per our [Editorial Policy](/editorial-policy/)</w:t>
       </w:r>
     </w:p>
     <w:p>
@@ -1385,7 +1385,16 @@
         <w:t>Last reviewed</w:t>
       </w:r>
       <w:r>
-        <w:t>: 2026-09-04</w:t>
+        <w:t xml:space="preserve">: 2026-09-04 · </w:t>
+      </w:r>
+      <w:r>
+        <w:rPr>
+          <w:b/>
+        </w:rPr>
+        <w:t>Fact sheet version</w:t>
+      </w:r>
+      <w:r>
+        <w:t>: v1.1-2026-09-04</w:t>
       </w:r>
     </w:p>
     <w:p>
@@ -1414,6 +1423,20 @@
       </w:r>
       <w:r>
         <w:t>: Two-database cross-check; single-source items flagged; no destination extrapolation</w:t>
+      </w:r>
+    </w:p>
+    <w:p>
+      <w:pPr>
+        <w:pStyle w:val="ListBullet"/>
+      </w:pPr>
+      <w:r>
+        <w:rPr>
+          <w:b/>
+        </w:rPr>
+        <w:t>Transparency</w:t>
+      </w:r>
+      <w:r>
+        <w:t>: AI_ASSISTED=true · HUMAN_REVIEWED=false · evidence.first_hand=false · PUBLISH_APPROVED=false</w:t>
       </w:r>
     </w:p>
     <w:p>

</xml_diff>